<commit_message>
docs: draf blok pyranometer.koreksi untuk ditinjau; status ringkasan POA diperbarui
Draf_Blok_Koreksi_POA.md: blok siap salin dari usulan kokoh (WS-3 x1,060
1 Jan-10 Agu 2026; WS-1 dikecualikan sejak bacaan pertama 12 Jan 2025),
divalidasi lewat _muat_poa atas data POA nyata tanpa mengubah config
(31.190 / 54.150 sampel; WB06 +6,0 %, WB08-10 +3,5 % / +7,0 %). Mencatat
yang sengaja tidak masuk (WS-2: bias +1,6 % tetap ada di pengisi WB08-10).

Ringkasan (md + docx, tetap 1 halaman): loader sudah membaca blok koreksi
sejak 3 Okt; bacaan nol WS-1 mulai Agu 2025 (bukan Okt); catatan merujuk
spesifikasi loader yang sudah diimplementasikan.

Co-Authored-By: Claude Opus 5.5 <noreply@anthropic.com>
</commit_message>
<xml_diff>
--- a/docs/Ringkasan_Usulan_Koreksi_POA.docx
+++ b/docs/Ringkasan_Usulan_Koreksi_POA.docx
@@ -24,7 +24,7 @@
         <w:rPr>
           <w:b w:val="0"/>
         </w:rPr>
-        <w:t xml:space="preserve"> 2 Oktober 2026 · </w:t>
+        <w:t xml:space="preserve"> 2 Oktober 2026 (status diperbarui 3 Oktober 2026) · </w:t>
       </w:r>
       <w:r>
         <w:rPr>
@@ -48,7 +48,7 @@
         <w:rPr>
           <w:b w:val="0"/>
         </w:rPr>
-        <w:t xml:space="preserve"> bahan keputusan; belum ada koreksi yang diterapkan (loader belum membaca kunci koreksi).</w:t>
+        <w:t xml:space="preserve"> bahan keputusan; belum ada koreksi yang diterapkan (loader sudah membaca blok pyranometer.koreksi sejak 3 Okt 2026, tetapi config belum memuatnya). Draf blok: docs/Draf_Blok_Koreksi_POA.md.</w:t>
       </w:r>
     </w:p>
     <w:p>
@@ -963,7 +963,7 @@
                 <w:b w:val="0"/>
                 <w:sz w:val="18"/>
               </w:rPr>
-              <w:t>Penghalang pukul 11–12 sejak Jun 2026, bacaan nol Okt 2025 – Mei 2026, banyak kandidat lompatan</w:t>
+              <w:t>Penghalang pukul 11–12 sejak Jun 2026, bacaan nol saat cerah Agu 2025 – Mei 2026, banyak kandidat lompatan</w:t>
             </w:r>
           </w:p>
         </w:tc>
@@ -1073,7 +1073,7 @@
         <w:rPr>
           <w:b w:val="0"/>
         </w:rPr>
-        <w:t xml:space="preserve"> penerapan koreksi butuh spesifikasi loader terpisah; sesudahnya kalibrasi derate diulang. Kandidat lompatan WS-4 pada 11 Jan 2026 (−7,7 %) adalah cermin lompatan WS-5 (acuan WS-4 hanya WS-5), bukan perubahan WS-4. Grafik rasio harian per WS terlampir terpisah (…_harian.png).</w:t>
+        <w:t xml:space="preserve"> loader sudah bisa menerapkan koreksi (spesifikasi 2026-10-02-penerapan-koreksi-poa-loader); sesudah blok masuk config, M2f dan kalibrasi derate diulang. Kandidat lompatan WS-4 pada 11 Jan 2026 (−7,7 %) adalah cermin lompatan WS-5 (acuan WS-4 hanya WS-5), bukan perubahan WS-4. Grafik rasio harian per WS terlampir terpisah (…_harian.png).</w:t>
       </w:r>
     </w:p>
     <w:sectPr>

</xml_diff>